<commit_message>
attempting to move header out of header space for ADA....
</commit_message>
<xml_diff>
--- a/report_generation/template - Copy.docx
+++ b/report_generation/template - Copy.docx
@@ -4,133 +4,34 @@
   <w:body>
     <w:p>
       <w:pPr>
-        <w:pStyle w:val="Title"/>
+        <w:pStyle w:val="Heading1"/>
       </w:pPr>
     </w:p>
     <w:p>
       <w:pPr>
         <w:pStyle w:val="Heading2"/>
-        <w:jc w:val="left"/>
-      </w:pPr>
-    </w:p>
-    <w:p/>
-    <w:p/>
-    <w:p>
-      <w:pPr>
-        <w:rPr>
-          <w:rFonts w:eastAsiaTheme="majorEastAsia" w:cstheme="majorBidi"/>
-          <w:b/>
-          <w:color w:val="156082" w:themeColor="accent1"/>
-          <w:sz w:val="30"/>
-          <w:szCs w:val="32"/>
-        </w:rPr>
       </w:pPr>
     </w:p>
     <w:p>
       <w:pPr>
-        <w:tabs>
-          <w:tab w:val="left" w:pos="3417"/>
-        </w:tabs>
-      </w:pPr>
-    </w:p>
-    <w:p/>
-    <w:p/>
-    <w:p/>
-    <w:p/>
-    <w:p/>
-    <w:p/>
-    <w:p/>
-    <w:p/>
-    <w:p/>
-    <w:p/>
-    <w:p/>
-    <w:p/>
-    <w:p/>
-    <w:p/>
-    <w:p/>
-    <w:p/>
-    <w:p/>
-    <w:p/>
-    <w:p/>
-    <w:p>
-      <w:pPr>
-        <w:tabs>
-          <w:tab w:val="left" w:pos="9020"/>
-        </w:tabs>
+        <w:pStyle w:val="Heading3"/>
       </w:pPr>
     </w:p>
     <w:p>
       <w:pPr>
-        <w:tabs>
-          <w:tab w:val="left" w:pos="6991"/>
-        </w:tabs>
-      </w:pPr>
-      <w:r>
-        <w:tab/>
-      </w:r>
-    </w:p>
-    <w:p>
-      <w:pPr>
-        <w:tabs>
-          <w:tab w:val="left" w:pos="6991"/>
-        </w:tabs>
+        <w:pStyle w:val="Heading4"/>
       </w:pPr>
     </w:p>
     <w:p>
       <w:pPr>
-        <w:tabs>
-          <w:tab w:val="left" w:pos="6991"/>
-        </w:tabs>
+        <w:pStyle w:val="tablecaption"/>
       </w:pPr>
     </w:p>
     <w:p/>
-    <w:p/>
-    <w:p/>
-    <w:p/>
-    <w:p/>
-    <w:p/>
-    <w:p/>
-    <w:p/>
-    <w:p/>
-    <w:p/>
-    <w:p/>
-    <w:p/>
-    <w:p/>
-    <w:p/>
-    <w:p/>
-    <w:p/>
-    <w:p/>
-    <w:p/>
-    <w:p/>
-    <w:p/>
-    <w:p/>
-    <w:p/>
-    <w:p/>
-    <w:p/>
-    <w:p/>
-    <w:p/>
-    <w:p/>
-    <w:p/>
-    <w:p>
-      <w:pPr>
-        <w:tabs>
-          <w:tab w:val="left" w:pos="6847"/>
-          <w:tab w:val="left" w:pos="8627"/>
-        </w:tabs>
-      </w:pPr>
-      <w:r>
-        <w:lastRenderedPageBreak/>
-        <w:tab/>
-      </w:r>
-      <w:r>
-        <w:tab/>
-      </w:r>
-    </w:p>
     <w:sectPr>
       <w:headerReference w:type="default" r:id="rId6"/>
       <w:footerReference w:type="default" r:id="rId7"/>
-      <w:headerReference w:type="first" r:id="rId8"/>
-      <w:footerReference w:type="first" r:id="rId9"/>
+      <w:footerReference w:type="first" r:id="rId8"/>
       <w:pgSz w:w="12240" w:h="15840"/>
       <w:pgMar w:top="720" w:right="720" w:bottom="720" w:left="720" w:header="720" w:footer="720" w:gutter="0"/>
       <w:cols w:space="720"/>
@@ -536,547 +437,14 @@
       <w:tabs>
         <w:tab w:val="clear" w:pos="4680"/>
         <w:tab w:val="clear" w:pos="9360"/>
+        <w:tab w:val="left" w:pos="4198"/>
       </w:tabs>
       <w:spacing w:before="0" w:after="240"/>
       <w:rPr>
-        <w:sz w:val="20"/>
-        <w:szCs w:val="20"/>
-      </w:rPr>
-    </w:pPr>
-    <w:r>
-      <w:rPr>
-        <w:sz w:val="20"/>
-        <w:szCs w:val="20"/>
-      </w:rPr>
-      <w:t>Volunteer Lake Assessment Program Individual Reports</w:t>
-    </w:r>
-    <w:r>
-      <w:rPr>
-        <w:sz w:val="20"/>
-        <w:szCs w:val="20"/>
-      </w:rPr>
-      <w:ptab w:relativeTo="margin" w:alignment="right" w:leader="none"/>
-    </w:r>
-    <w:r>
-      <w:rPr>
-        <w:sz w:val="20"/>
-        <w:szCs w:val="20"/>
-      </w:rPr>
-      <w:t>Report number: &lt;&lt;pub&gt;&gt;</w:t>
-    </w:r>
-    <w:r>
-      <w:rPr>
-        <w:noProof/>
-        <w:color w:val="000000" w:themeColor="text1"/>
-        <w:sz w:val="56"/>
-        <w:szCs w:val="56"/>
-      </w:rPr>
-      <mc:AlternateContent>
-        <mc:Choice Requires="wps">
-          <w:drawing>
-            <wp:anchor distT="0" distB="0" distL="114300" distR="114300" simplePos="0" relativeHeight="251664384" behindDoc="0" locked="0" layoutInCell="1" allowOverlap="1" wp14:anchorId="48690EF1" wp14:editId="24F56D0F">
-              <wp:simplePos x="0" y="0"/>
-              <wp:positionH relativeFrom="column">
-                <wp:posOffset>-177282</wp:posOffset>
-              </wp:positionH>
-              <wp:positionV relativeFrom="paragraph">
-                <wp:posOffset>172253</wp:posOffset>
-              </wp:positionV>
-              <wp:extent cx="7259217" cy="0"/>
-              <wp:effectExtent l="0" t="0" r="0" b="0"/>
-              <wp:wrapNone/>
-              <wp:docPr id="1755723922" name="Straight Connector 1">
-                <a:extLst xmlns:a="http://schemas.openxmlformats.org/drawingml/2006/main">
-                  <a:ext uri="{C183D7F6-B498-43B3-948B-1728B52AA6E4}">
-                    <adec:decorative xmlns:adec="http://schemas.microsoft.com/office/drawing/2017/decorative" val="1"/>
-                  </a:ext>
-                </a:extLst>
-              </wp:docPr>
-              <wp:cNvGraphicFramePr/>
-              <a:graphic xmlns:a="http://schemas.openxmlformats.org/drawingml/2006/main">
-                <a:graphicData uri="http://schemas.microsoft.com/office/word/2010/wordprocessingShape">
-                  <wps:wsp>
-                    <wps:cNvCnPr/>
-                    <wps:spPr>
-                      <a:xfrm>
-                        <a:off x="0" y="0"/>
-                        <a:ext cx="7259217" cy="0"/>
-                      </a:xfrm>
-                      <a:prstGeom prst="line">
-                        <a:avLst/>
-                      </a:prstGeom>
-                      <a:ln w="12700">
-                        <a:solidFill>
-                          <a:schemeClr val="accent1"/>
-                        </a:solidFill>
-                      </a:ln>
-                    </wps:spPr>
-                    <wps:style>
-                      <a:lnRef idx="1">
-                        <a:schemeClr val="accent1"/>
-                      </a:lnRef>
-                      <a:fillRef idx="0">
-                        <a:schemeClr val="accent1"/>
-                      </a:fillRef>
-                      <a:effectRef idx="0">
-                        <a:schemeClr val="accent1"/>
-                      </a:effectRef>
-                      <a:fontRef idx="minor">
-                        <a:schemeClr val="tx1"/>
-                      </a:fontRef>
-                    </wps:style>
-                    <wps:bodyPr/>
-                  </wps:wsp>
-                </a:graphicData>
-              </a:graphic>
-              <wp14:sizeRelH relativeFrom="margin">
-                <wp14:pctWidth>0</wp14:pctWidth>
-              </wp14:sizeRelH>
-            </wp:anchor>
-          </w:drawing>
-        </mc:Choice>
-        <mc:Fallback>
-          <w:pict>
-            <v:line w14:anchorId="2D836003" id="Straight Connector 1" o:spid="_x0000_s1026" alt="&quot;&quot;" style="position:absolute;z-index:251664384;visibility:visible;mso-wrap-style:square;mso-width-percent:0;mso-wrap-distance-left:9pt;mso-wrap-distance-top:0;mso-wrap-distance-right:9pt;mso-wrap-distance-bottom:0;mso-position-horizontal:absolute;mso-position-horizontal-relative:text;mso-position-vertical:absolute;mso-position-vertical-relative:text;mso-width-percent:0;mso-width-relative:margin" from="-13.95pt,13.55pt" to="557.65pt,13.55pt" o:gfxdata="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" strokecolor="#156082 [3204]" strokeweight="1pt">
-              <v:stroke joinstyle="miter"/>
-            </v:line>
-          </w:pict>
-        </mc:Fallback>
-      </mc:AlternateContent>
-    </w:r>
-  </w:p>
-</w:hdr>
-</file>
-
-<file path=word/header2.xml><?xml version="1.0" encoding="utf-8"?>
-<w:hdr xmlns:wpc="http://schemas.microsoft.com/office/word/2010/wordprocessingCanvas" xmlns:cx="http://schemas.microsoft.com/office/drawing/2014/chartex" xmlns:cx1="http://schemas.microsoft.com/office/drawing/2015/9/8/chartex" xmlns:cx2="http://schemas.microsoft.com/office/drawing/2015/10/21/chartex" xmlns:cx3="http://schemas.microsoft.com/office/drawing/2016/5/9/chartex" xmlns:cx4="http://schemas.microsoft.com/office/drawing/2016/5/10/chartex" xmlns:cx5="http://schemas.microsoft.com/office/drawing/2016/5/11/chartex" xmlns:cx6="http://schemas.microsoft.com/office/drawing/2016/5/12/chartex" xmlns:cx7="http://schemas.microsoft.com/office/drawing/2016/5/13/chartex" xmlns:cx8="http://schemas.microsoft.com/office/drawing/2016/5/14/chartex" xmlns:mc="http://schemas.openxmlformats.org/markup-compatibility/2006" xmlns:aink="http://schemas.microsoft.com/office/drawing/2016/ink" xmlns:am3d="http://schemas.microsoft.com/office/drawing/2017/model3d" xmlns:o="urn:schemas-microsoft-com:office:office" xmlns:oel="http://schemas.microsoft.com/office/2019/extlst" xmlns:r="http://schemas.openxmlformats.org/officeDocument/2006/relationships" xmlns:m="http://schemas.openxmlformats.org/officeDocument/2006/math" xmlns:v="urn:schemas-microsoft-com:vml" xmlns:wp14="http://schemas.microsoft.com/office/word/2010/wordprocessingDrawing" xmlns:wp="http://schemas.openxmlformats.org/drawingml/2006/wordprocessingDrawing" xmlns:w10="urn:schemas-microsoft-com:office:word" xmlns:w="http://schemas.openxmlformats.org/wordprocessingml/2006/main" xmlns:w14="http://schemas.microsoft.com/office/word/2010/wordml" xmlns:w15="http://schemas.microsoft.com/office/word/2012/wordml" xmlns:w16cex="http://schemas.microsoft.com/office/word/2018/wordml/cex" xmlns:w16cid="http://schemas.microsoft.com/office/word/2016/wordml/cid" xmlns:w16="http://schemas.microsoft.com/office/word/2018/wordml" xmlns:w16du="http://schemas.microsoft.com/office/word/2023/wordml/word16du" xmlns:w16sdtdh="http://schemas.microsoft.com/office/word/2020/wordml/sdtdatahash" xmlns:w16sdtfl="http://schemas.microsoft.com/office/word/2024/wordml/sdtformatlock" xmlns:w16se="http://schemas.microsoft.com/office/word/2015/wordml/symex" xmlns:wpg="http://schemas.microsoft.com/office/word/2010/wordprocessingGroup" xmlns:wpi="http://schemas.microsoft.com/office/word/2010/wordprocessingInk" xmlns:wne="http://schemas.microsoft.com/office/word/2006/wordml" xmlns:wps="http://schemas.microsoft.com/office/word/2010/wordprocessingShape" mc:Ignorable="w14 w15 w16se w16cid w16 w16cex w16sdtdh w16sdtfl w16du wp14">
-  <w:p>
-    <w:pPr>
-      <w:pStyle w:val="Title"/>
-      <w:spacing w:before="0"/>
-    </w:pPr>
-    <w:r>
-      <w:rPr>
-        <w:noProof/>
-        <w:color w:val="000000" w:themeColor="text1"/>
-        <w:sz w:val="56"/>
-        <w:szCs w:val="56"/>
-      </w:rPr>
-      <mc:AlternateContent>
-        <mc:Choice Requires="wps">
-          <w:drawing>
-            <wp:anchor distT="0" distB="0" distL="114300" distR="114300" simplePos="0" relativeHeight="251666432" behindDoc="0" locked="0" layoutInCell="1" allowOverlap="1" wp14:anchorId="59776FEE" wp14:editId="5F56251C">
-              <wp:simplePos x="0" y="0"/>
-              <wp:positionH relativeFrom="column">
-                <wp:posOffset>0</wp:posOffset>
-              </wp:positionH>
-              <wp:positionV relativeFrom="paragraph">
-                <wp:posOffset>-22274</wp:posOffset>
-              </wp:positionV>
-              <wp:extent cx="6774180" cy="0"/>
-              <wp:effectExtent l="0" t="0" r="0" b="0"/>
-              <wp:wrapNone/>
-              <wp:docPr id="1530092982" name="Straight Connector 1">
-                <a:extLst xmlns:a="http://schemas.openxmlformats.org/drawingml/2006/main">
-                  <a:ext uri="{C183D7F6-B498-43B3-948B-1728B52AA6E4}">
-                    <adec:decorative xmlns:adec="http://schemas.microsoft.com/office/drawing/2017/decorative" val="1"/>
-                  </a:ext>
-                </a:extLst>
-              </wp:docPr>
-              <wp:cNvGraphicFramePr/>
-              <a:graphic xmlns:a="http://schemas.openxmlformats.org/drawingml/2006/main">
-                <a:graphicData uri="http://schemas.microsoft.com/office/word/2010/wordprocessingShape">
-                  <wps:wsp>
-                    <wps:cNvCnPr/>
-                    <wps:spPr>
-                      <a:xfrm>
-                        <a:off x="0" y="0"/>
-                        <a:ext cx="6774180" cy="0"/>
-                      </a:xfrm>
-                      <a:prstGeom prst="line">
-                        <a:avLst/>
-                      </a:prstGeom>
-                      <a:ln w="12700">
-                        <a:solidFill>
-                          <a:schemeClr val="accent1"/>
-                        </a:solidFill>
-                      </a:ln>
-                    </wps:spPr>
-                    <wps:style>
-                      <a:lnRef idx="1">
-                        <a:schemeClr val="accent1"/>
-                      </a:lnRef>
-                      <a:fillRef idx="0">
-                        <a:schemeClr val="accent1"/>
-                      </a:fillRef>
-                      <a:effectRef idx="0">
-                        <a:schemeClr val="accent1"/>
-                      </a:effectRef>
-                      <a:fontRef idx="minor">
-                        <a:schemeClr val="tx1"/>
-                      </a:fontRef>
-                    </wps:style>
-                    <wps:bodyPr/>
-                  </wps:wsp>
-                </a:graphicData>
-              </a:graphic>
-              <wp14:sizeRelH relativeFrom="margin">
-                <wp14:pctWidth>0</wp14:pctWidth>
-              </wp14:sizeRelH>
-            </wp:anchor>
-          </w:drawing>
-        </mc:Choice>
-        <mc:Fallback>
-          <w:pict>
-            <v:line w14:anchorId="7C16F3DD" id="Straight Connector 1" o:spid="_x0000_s1026" alt="&quot;&quot;" style="position:absolute;z-index:251666432;visibility:visible;mso-wrap-style:square;mso-width-percent:0;mso-wrap-distance-left:9pt;mso-wrap-distance-top:0;mso-wrap-distance-right:9pt;mso-wrap-distance-bottom:0;mso-position-horizontal:absolute;mso-position-horizontal-relative:text;mso-position-vertical:absolute;mso-position-vertical-relative:text;mso-width-percent:0;mso-width-relative:margin" from="0,-1.75pt" to="533.4pt,-1.75pt" o:gfxdata="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" strokecolor="#156082 [3204]" strokeweight="1pt">
-              <v:stroke joinstyle="miter"/>
-            </v:line>
-          </w:pict>
-        </mc:Fallback>
-      </mc:AlternateContent>
-    </w:r>
-    <w:r>
-      <w:rPr>
-        <w:noProof/>
-        <w:color w:val="156082" w:themeColor="accent1"/>
-        <w:sz w:val="22"/>
-        <w:szCs w:val="22"/>
-      </w:rPr>
-      <w:drawing>
-        <wp:anchor distT="0" distB="0" distL="114300" distR="114300" simplePos="0" relativeHeight="251662336" behindDoc="1" locked="0" layoutInCell="1" allowOverlap="1" wp14:anchorId="4663F0C6" wp14:editId="3B42F61C">
-          <wp:simplePos x="0" y="0"/>
-          <wp:positionH relativeFrom="column">
-            <wp:posOffset>5333951</wp:posOffset>
-          </wp:positionH>
-          <wp:positionV relativeFrom="paragraph">
-            <wp:posOffset>-45720</wp:posOffset>
-          </wp:positionV>
-          <wp:extent cx="1472565" cy="855980"/>
-          <wp:effectExtent l="0" t="0" r="0" b="1270"/>
-          <wp:wrapTight wrapText="bothSides">
-            <wp:wrapPolygon edited="0">
-              <wp:start x="0" y="0"/>
-              <wp:lineTo x="0" y="21151"/>
-              <wp:lineTo x="21237" y="21151"/>
-              <wp:lineTo x="21237" y="0"/>
-              <wp:lineTo x="0" y="0"/>
-            </wp:wrapPolygon>
-          </wp:wrapTight>
-          <wp:docPr id="394384637" name="Picture 2" descr="Logo for the New Hampshire Department of Environmental Services"/>
-          <wp:cNvGraphicFramePr>
-            <a:graphicFrameLocks xmlns:a="http://schemas.openxmlformats.org/drawingml/2006/main" noChangeAspect="1"/>
-          </wp:cNvGraphicFramePr>
-          <a:graphic xmlns:a="http://schemas.openxmlformats.org/drawingml/2006/main">
-            <a:graphicData uri="http://schemas.openxmlformats.org/drawingml/2006/picture">
-              <pic:pic xmlns:pic="http://schemas.openxmlformats.org/drawingml/2006/picture">
-                <pic:nvPicPr>
-                  <pic:cNvPr id="394384637" name="Picture 2" descr="Logo for the New Hampshire Department of Environmental Services"/>
-                  <pic:cNvPicPr>
-                    <a:picLocks noChangeAspect="1" noChangeArrowheads="1"/>
-                  </pic:cNvPicPr>
-                </pic:nvPicPr>
-                <pic:blipFill>
-                  <a:blip r:embed="rId1">
-                    <a:extLst>
-                      <a:ext uri="{28A0092B-C50C-407E-A947-70E740481C1C}">
-                        <a14:useLocalDpi xmlns:a14="http://schemas.microsoft.com/office/drawing/2010/main" val="0"/>
-                      </a:ext>
-                    </a:extLst>
-                  </a:blip>
-                  <a:stretch>
-                    <a:fillRect/>
-                  </a:stretch>
-                </pic:blipFill>
-                <pic:spPr bwMode="auto">
-                  <a:xfrm>
-                    <a:off x="0" y="0"/>
-                    <a:ext cx="1472565" cy="855980"/>
-                  </a:xfrm>
-                  <a:prstGeom prst="rect">
-                    <a:avLst/>
-                  </a:prstGeom>
-                  <a:noFill/>
-                  <a:ln>
-                    <a:noFill/>
-                  </a:ln>
-                </pic:spPr>
-              </pic:pic>
-            </a:graphicData>
-          </a:graphic>
-          <wp14:sizeRelH relativeFrom="page">
-            <wp14:pctWidth>0</wp14:pctWidth>
-          </wp14:sizeRelH>
-          <wp14:sizeRelV relativeFrom="page">
-            <wp14:pctHeight>0</wp14:pctHeight>
-          </wp14:sizeRelV>
-        </wp:anchor>
-      </w:drawing>
-    </w:r>
-    <w:r>
-      <w:t>Volunteer Lake Assessment Program – Individual Report</w:t>
-    </w:r>
-    <w:r>
-      <w:t>s</w:t>
-    </w:r>
-  </w:p>
-  <w:p>
-    <w:pPr>
-      <w:spacing w:before="0" w:after="120"/>
-      <w:rPr>
-        <w:szCs w:val="22"/>
-      </w:rPr>
-    </w:pPr>
-    <w:r>
-      <w:rPr>
-        <w:noProof/>
-        <w:color w:val="000000" w:themeColor="text1"/>
-        <w:sz w:val="56"/>
-        <w:szCs w:val="56"/>
-      </w:rPr>
-      <mc:AlternateContent>
-        <mc:Choice Requires="wps">
-          <w:drawing>
-            <wp:anchor distT="0" distB="0" distL="114300" distR="114300" simplePos="0" relativeHeight="251668480" behindDoc="0" locked="0" layoutInCell="1" allowOverlap="1" wp14:anchorId="063E15CB" wp14:editId="1064929B">
-              <wp:simplePos x="0" y="0"/>
-              <wp:positionH relativeFrom="column">
-                <wp:posOffset>0</wp:posOffset>
-              </wp:positionH>
-              <wp:positionV relativeFrom="paragraph">
-                <wp:posOffset>208296</wp:posOffset>
-              </wp:positionV>
-              <wp:extent cx="5203767" cy="0"/>
-              <wp:effectExtent l="0" t="0" r="0" b="0"/>
-              <wp:wrapNone/>
-              <wp:docPr id="867697921" name="Straight Connector 1">
-                <a:extLst xmlns:a="http://schemas.openxmlformats.org/drawingml/2006/main">
-                  <a:ext uri="{C183D7F6-B498-43B3-948B-1728B52AA6E4}">
-                    <adec:decorative xmlns:adec="http://schemas.microsoft.com/office/drawing/2017/decorative" val="1"/>
-                  </a:ext>
-                </a:extLst>
-              </wp:docPr>
-              <wp:cNvGraphicFramePr/>
-              <a:graphic xmlns:a="http://schemas.openxmlformats.org/drawingml/2006/main">
-                <a:graphicData uri="http://schemas.microsoft.com/office/word/2010/wordprocessingShape">
-                  <wps:wsp>
-                    <wps:cNvCnPr/>
-                    <wps:spPr>
-                      <a:xfrm>
-                        <a:off x="0" y="0"/>
-                        <a:ext cx="5203767" cy="0"/>
-                      </a:xfrm>
-                      <a:prstGeom prst="line">
-                        <a:avLst/>
-                      </a:prstGeom>
-                      <a:ln w="12700">
-                        <a:solidFill>
-                          <a:schemeClr val="accent1"/>
-                        </a:solidFill>
-                      </a:ln>
-                    </wps:spPr>
-                    <wps:style>
-                      <a:lnRef idx="1">
-                        <a:schemeClr val="accent1"/>
-                      </a:lnRef>
-                      <a:fillRef idx="0">
-                        <a:schemeClr val="accent1"/>
-                      </a:fillRef>
-                      <a:effectRef idx="0">
-                        <a:schemeClr val="accent1"/>
-                      </a:effectRef>
-                      <a:fontRef idx="minor">
-                        <a:schemeClr val="tx1"/>
-                      </a:fontRef>
-                    </wps:style>
-                    <wps:bodyPr/>
-                  </wps:wsp>
-                </a:graphicData>
-              </a:graphic>
-              <wp14:sizeRelH relativeFrom="margin">
-                <wp14:pctWidth>0</wp14:pctWidth>
-              </wp14:sizeRelH>
-            </wp:anchor>
-          </w:drawing>
-        </mc:Choice>
-        <mc:Fallback>
-          <w:pict>
-            <v:line w14:anchorId="3D413A04" id="Straight Connector 1" o:spid="_x0000_s1026" alt="&quot;&quot;" style="position:absolute;z-index:251668480;visibility:visible;mso-wrap-style:square;mso-width-percent:0;mso-wrap-distance-left:9pt;mso-wrap-distance-top:0;mso-wrap-distance-right:9pt;mso-wrap-distance-bottom:0;mso-position-horizontal:absolute;mso-position-horizontal-relative:text;mso-position-vertical:absolute;mso-position-vertical-relative:text;mso-width-percent:0;mso-width-relative:margin" from="0,16.4pt" to="409.75pt,16.4pt" o:gfxdata="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" strokecolor="#156082 [3204]" strokeweight="1pt">
-              <v:stroke joinstyle="miter"/>
-            </v:line>
-          </w:pict>
-        </mc:Fallback>
-      </mc:AlternateContent>
-    </w:r>
-    <w:r>
-      <w:rPr>
-        <w:color w:val="156082" w:themeColor="accent1"/>
-        <w:szCs w:val="22"/>
-      </w:rPr>
-      <w:t xml:space="preserve">29 Hazen Drive, Concord, New Hampshire 03301 </w:t>
-    </w:r>
-    <w:r>
-      <w:rPr>
-        <w:color w:val="156082" w:themeColor="accent1"/>
-        <w:sz w:val="12"/>
-        <w:szCs w:val="12"/>
-      </w:rPr>
-      <w:sym w:font="Wingdings" w:char="F06C"/>
-    </w:r>
-    <w:r>
-      <w:rPr>
-        <w:color w:val="156082" w:themeColor="accent1"/>
-        <w:szCs w:val="22"/>
-      </w:rPr>
-      <w:t xml:space="preserve"> </w:t>
-    </w:r>
-    <w:hyperlink r:id="rId2" w:history="1">
-      <w:r>
-        <w:rPr>
-          <w:rStyle w:val="Hyperlink"/>
-          <w:color w:val="0000FF"/>
-          <w:szCs w:val="22"/>
-        </w:rPr>
-        <w:t>(603) 271-2658</w:t>
-      </w:r>
-    </w:hyperlink>
-    <w:r>
-      <w:rPr>
-        <w:color w:val="156082" w:themeColor="accent1"/>
-        <w:szCs w:val="22"/>
-      </w:rPr>
-      <w:t xml:space="preserve"> </w:t>
-    </w:r>
-    <w:r>
-      <w:rPr>
-        <w:color w:val="156082" w:themeColor="accent1"/>
-        <w:sz w:val="12"/>
-        <w:szCs w:val="12"/>
-      </w:rPr>
-      <w:sym w:font="Wingdings" w:char="F06C"/>
-    </w:r>
-    <w:r>
-      <w:rPr>
-        <w:color w:val="156082" w:themeColor="accent1"/>
-        <w:szCs w:val="22"/>
-      </w:rPr>
-      <w:t xml:space="preserve"> </w:t>
-    </w:r>
-    <w:hyperlink r:id="rId3" w:history="1">
-      <w:r>
-        <w:rPr>
-          <w:rStyle w:val="Hyperlink"/>
-          <w:color w:val="0000FF"/>
-          <w:szCs w:val="22"/>
-        </w:rPr>
-        <w:t>www.des.nh.gov</w:t>
-      </w:r>
-    </w:hyperlink>
-    <w:r>
-      <w:rPr>
-        <w:szCs w:val="22"/>
-      </w:rPr>
-      <w:tab/>
-    </w:r>
-  </w:p>
-  <w:p>
-    <w:pPr>
-      <w:pStyle w:val="Header"/>
-      <w:tabs>
-        <w:tab w:val="left" w:pos="314"/>
-        <w:tab w:val="right" w:pos="8940"/>
-      </w:tabs>
-      <w:spacing w:before="0" w:after="120"/>
-      <w:rPr>
-        <w:sz w:val="20"/>
-        <w:szCs w:val="22"/>
-      </w:rPr>
-    </w:pPr>
-    <w:r>
-      <w:rPr>
-        <w:noProof/>
-        <w:color w:val="000000" w:themeColor="text1"/>
-        <w:sz w:val="56"/>
-        <w:szCs w:val="56"/>
-      </w:rPr>
-      <mc:AlternateContent>
-        <mc:Choice Requires="wps">
-          <w:drawing>
-            <wp:anchor distT="0" distB="0" distL="114300" distR="114300" simplePos="0" relativeHeight="251670528" behindDoc="0" locked="0" layoutInCell="1" allowOverlap="1" wp14:anchorId="66964CEB" wp14:editId="3038DC34">
-              <wp:simplePos x="0" y="0"/>
-              <wp:positionH relativeFrom="column">
-                <wp:posOffset>-611</wp:posOffset>
-              </wp:positionH>
-              <wp:positionV relativeFrom="paragraph">
-                <wp:posOffset>202557</wp:posOffset>
-              </wp:positionV>
-              <wp:extent cx="6774180" cy="0"/>
-              <wp:effectExtent l="0" t="0" r="0" b="0"/>
-              <wp:wrapNone/>
-              <wp:docPr id="176260470" name="Straight Connector 1">
-                <a:extLst xmlns:a="http://schemas.openxmlformats.org/drawingml/2006/main">
-                  <a:ext uri="{C183D7F6-B498-43B3-948B-1728B52AA6E4}">
-                    <adec:decorative xmlns:adec="http://schemas.microsoft.com/office/drawing/2017/decorative" val="1"/>
-                  </a:ext>
-                </a:extLst>
-              </wp:docPr>
-              <wp:cNvGraphicFramePr/>
-              <a:graphic xmlns:a="http://schemas.openxmlformats.org/drawingml/2006/main">
-                <a:graphicData uri="http://schemas.microsoft.com/office/word/2010/wordprocessingShape">
-                  <wps:wsp>
-                    <wps:cNvCnPr/>
-                    <wps:spPr>
-                      <a:xfrm>
-                        <a:off x="0" y="0"/>
-                        <a:ext cx="6774180" cy="0"/>
-                      </a:xfrm>
-                      <a:prstGeom prst="line">
-                        <a:avLst/>
-                      </a:prstGeom>
-                      <a:ln w="12700">
-                        <a:solidFill>
-                          <a:schemeClr val="accent1"/>
-                        </a:solidFill>
-                      </a:ln>
-                    </wps:spPr>
-                    <wps:style>
-                      <a:lnRef idx="1">
-                        <a:schemeClr val="accent1"/>
-                      </a:lnRef>
-                      <a:fillRef idx="0">
-                        <a:schemeClr val="accent1"/>
-                      </a:fillRef>
-                      <a:effectRef idx="0">
-                        <a:schemeClr val="accent1"/>
-                      </a:effectRef>
-                      <a:fontRef idx="minor">
-                        <a:schemeClr val="tx1"/>
-                      </a:fontRef>
-                    </wps:style>
-                    <wps:bodyPr/>
-                  </wps:wsp>
-                </a:graphicData>
-              </a:graphic>
-              <wp14:sizeRelH relativeFrom="margin">
-                <wp14:pctWidth>0</wp14:pctWidth>
-              </wp14:sizeRelH>
-            </wp:anchor>
-          </w:drawing>
-        </mc:Choice>
-        <mc:Fallback>
-          <w:pict>
-            <v:line w14:anchorId="0E20F8EF" id="Straight Connector 1" o:spid="_x0000_s1026" alt="&quot;&quot;" style="position:absolute;z-index:251670528;visibility:visible;mso-wrap-style:square;mso-width-percent:0;mso-wrap-distance-left:9pt;mso-wrap-distance-top:0;mso-wrap-distance-right:9pt;mso-wrap-distance-bottom:0;mso-position-horizontal:absolute;mso-position-horizontal-relative:text;mso-position-vertical:absolute;mso-position-vertical-relative:text;mso-width-percent:0;mso-width-relative:margin" from="-.05pt,15.95pt" to="533.35pt,15.95pt" o:gfxdata="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" strokecolor="#156082 [3204]" strokeweight="1pt">
-              <v:stroke joinstyle="miter"/>
-            </v:line>
-          </w:pict>
-        </mc:Fallback>
-      </mc:AlternateContent>
-    </w:r>
-    <w:r>
-      <w:rPr>
-        <w:sz w:val="20"/>
-        <w:szCs w:val="22"/>
-      </w:rPr>
-      <w:t>Report number: &lt;&lt;pub&gt;&gt;</w:t>
-    </w:r>
+        <w:sz w:val="2"/>
+        <w:szCs w:val="2"/>
+      </w:rPr>
+    </w:pPr>
   </w:p>
 </w:hdr>
 </file>
@@ -1518,7 +886,7 @@
     <w:uiPriority w:val="9"/>
     <w:unhideWhenUsed/>
     <w:qFormat/>
-    <w:rsid w:val="00C56C7C"/>
+    <w:rsid w:val="002F09C3"/>
     <w:pPr>
       <w:keepNext/>
       <w:keepLines/>
@@ -1732,7 +1100,7 @@
     <w:basedOn w:val="DefaultParagraphFont"/>
     <w:link w:val="Heading2"/>
     <w:uiPriority w:val="9"/>
-    <w:rsid w:val="00C56C7C"/>
+    <w:rsid w:val="002F09C3"/>
     <w:rPr>
       <w:rFonts w:eastAsiaTheme="majorEastAsia" w:cstheme="majorBidi"/>
       <w:b/>
@@ -2170,6 +1538,64 @@
     <w:basedOn w:val="DefaultParagraphFont"/>
     <w:link w:val="figurecaption"/>
     <w:rsid w:val="000469D8"/>
+  </w:style>
+  <w:style w:type="paragraph" w:customStyle="1" w:styleId="SubHeading">
+    <w:name w:val="SubHeading"/>
+    <w:basedOn w:val="Normal"/>
+    <w:link w:val="SubHeadingChar"/>
+    <w:autoRedefine/>
+    <w:qFormat/>
+    <w:rsid w:val="001E0F64"/>
+    <w:pPr>
+      <w:spacing w:before="0" w:after="0"/>
+    </w:pPr>
+    <w:rPr>
+      <w:noProof/>
+      <w:color w:val="156082" w:themeColor="accent1"/>
+      <w:szCs w:val="56"/>
+    </w:rPr>
+  </w:style>
+  <w:style w:type="character" w:customStyle="1" w:styleId="SubHeadingChar">
+    <w:name w:val="SubHeading Char"/>
+    <w:basedOn w:val="DefaultParagraphFont"/>
+    <w:link w:val="SubHeading"/>
+    <w:rsid w:val="001E0F64"/>
+    <w:rPr>
+      <w:noProof/>
+      <w:color w:val="156082" w:themeColor="accent1"/>
+      <w:szCs w:val="56"/>
+    </w:rPr>
+  </w:style>
+  <w:style w:type="paragraph" w:customStyle="1" w:styleId="SubSubHeading">
+    <w:name w:val="SubSubHeading"/>
+    <w:basedOn w:val="Header"/>
+    <w:link w:val="SubSubHeadingChar"/>
+    <w:autoRedefine/>
+    <w:qFormat/>
+    <w:rsid w:val="004F311C"/>
+    <w:pPr>
+      <w:tabs>
+        <w:tab w:val="left" w:pos="314"/>
+        <w:tab w:val="right" w:pos="8940"/>
+      </w:tabs>
+      <w:spacing w:before="0" w:after="120"/>
+    </w:pPr>
+    <w:rPr>
+      <w:noProof/>
+      <w:color w:val="000000" w:themeColor="text1"/>
+      <w:szCs w:val="56"/>
+    </w:rPr>
+  </w:style>
+  <w:style w:type="character" w:customStyle="1" w:styleId="SubSubHeadingChar">
+    <w:name w:val="SubSubHeading Char"/>
+    <w:basedOn w:val="HeaderChar"/>
+    <w:link w:val="SubSubHeading"/>
+    <w:rsid w:val="004F311C"/>
+    <w:rPr>
+      <w:noProof/>
+      <w:color w:val="000000" w:themeColor="text1"/>
+      <w:szCs w:val="56"/>
+    </w:rPr>
   </w:style>
 </w:styles>
 </file>

</xml_diff>